<commit_message>
Add ClearDisk command: wipe SyncDir on both sides with one command
- New FILE_DISK_CMD packet (Action=ClearDisk) sent via clipboard; receiver clears its SyncDir and ACKs

- New mode: FileTransfer.ps1 ClearDisk (local wipe + empty change.log + listener restart + remote command)

- Docs updated: README.md, SPEC.md, ReadMe.docx
</commit_message>
<xml_diff>
--- a/ReadMe.docx
+++ b/ReadMe.docx
@@ -522,7 +522,7 @@
         <w:t>ПК-приёмник</w:t>
       </w:r>
       <w:r>
-        <w:t xml:space="preserve">.        </w:t>
+        <w:t>.</w:t>
       </w:r>
       <w:r>
         <w:rPr>
@@ -1028,6 +1028,91 @@
           <w:b/>
           <w:color w:val="000000"/>
         </w:rPr>
+        <w:t>Полная очистка папки disk на обоих контурах:</w:t>
+      </w:r>
+      <w:r>
+        <w:rPr>
+          <w:rFonts w:ascii="Calibri" w:hAnsi="Calibri" w:cs="Calibri"/>
+          <w:color w:val="000000"/>
+        </w:rPr>
+        <w:t xml:space="preserve"> команда  </w:t>
+      </w:r>
+      <w:r>
+        <w:rPr>
+          <w:rFonts w:ascii="Consolas" w:hAnsi="Consolas" w:cs="Calibri"/>
+          <w:color w:val="7F7F7F"/>
+        </w:rPr>
+        <w:t>FileTransfer.ps1 ClearDisk</w:t>
+      </w:r>
+      <w:r>
+        <w:rPr>
+          <w:rFonts w:ascii="Calibri" w:hAnsi="Calibri" w:cs="Calibri"/>
+          <w:color w:val="000000"/>
+        </w:rPr>
+        <w:t xml:space="preserve"> удаляет всё содержимое </w:t>
+      </w:r>
+      <w:r>
+        <w:rPr>
+          <w:rFonts w:ascii="Consolas" w:hAnsi="Consolas" w:cs="Calibri"/>
+          <w:color w:val="7F7F7F"/>
+        </w:rPr>
+        <w:t>SyncDir</w:t>
+      </w:r>
+      <w:r>
+        <w:rPr>
+          <w:rFonts w:ascii="Calibri" w:hAnsi="Calibri" w:cs="Calibri"/>
+          <w:color w:val="000000"/>
+        </w:rPr>
+        <w:t xml:space="preserve"> (включая </w:t>
+      </w:r>
+      <w:r>
+        <w:rPr>
+          <w:rFonts w:ascii="Consolas" w:hAnsi="Consolas" w:cs="Calibri"/>
+          <w:color w:val="7F7F7F"/>
+        </w:rPr>
+        <w:t>change.log</w:t>
+      </w:r>
+      <w:r>
+        <w:rPr>
+          <w:rFonts w:ascii="Calibri" w:hAnsi="Calibri" w:cs="Calibri"/>
+          <w:color w:val="000000"/>
+        </w:rPr>
+        <w:t xml:space="preserve">)  на том контуре, где запущена, кладёт в буфер пакет-команду </w:t>
+      </w:r>
+      <w:r>
+        <w:rPr>
+          <w:rFonts w:ascii="Consolas" w:hAnsi="Consolas" w:cs="Calibri"/>
+          <w:color w:val="7F7F7F"/>
+        </w:rPr>
+        <w:t>FILE_DISK_CMD</w:t>
+      </w:r>
+      <w:r>
+        <w:rPr>
+          <w:rFonts w:ascii="Calibri" w:hAnsi="Calibri" w:cs="Calibri"/>
+          <w:color w:val="000000"/>
+        </w:rPr>
+        <w:t xml:space="preserve">, а  слушатель на другом контуре выполняет очистку у себя и подтверждает приём очисткой  буфера. Пустой </w:t>
+      </w:r>
+      <w:r>
+        <w:rPr>
+          <w:rFonts w:ascii="Consolas" w:hAnsi="Consolas" w:cs="Calibri"/>
+          <w:color w:val="7F7F7F"/>
+        </w:rPr>
+        <w:t>change.log</w:t>
+      </w:r>
+      <w:r>
+        <w:rPr>
+          <w:rFonts w:ascii="Calibri" w:hAnsi="Calibri" w:cs="Calibri"/>
+          <w:color w:val="000000"/>
+        </w:rPr>
+        <w:t xml:space="preserve"> создаётся заново, так что новые файлы по-прежнему будут  синхронизироваться. Если слушатель на другом конце выключен — команда забирается  обратно по таймауту, локальная папка остаётся очищенной (повторите команду позже).</w:t>
+      </w:r>
+      <w:r>
+        <w:rPr>
+          <w:rFonts w:ascii="Calibri" w:hAnsi="Calibri" w:cs="Calibri"/>
+          <w:b/>
+          <w:color w:val="000000"/>
+        </w:rPr>
         <w:t>Файлы лежат в disk, но не уходят?</w:t>
       </w:r>
       <w:r>
@@ -1478,7 +1563,15 @@
           <w:rFonts w:ascii="Calibri" w:hAnsi="Calibri" w:cs="Calibri"/>
           <w:color w:val="000000"/>
         </w:rPr>
-        <w:t>: каждый цикл опроса записывается с причиной — пустой буфер /  чужой текст / свой пакет (ждём ACK) / время до скана / файл уже обработан /  файл занят записью / не отправлен (причина выше в журнале).Сценарий 5: Сохранение RDP-сеанса (keep-alive)</w:t>
+        <w:t xml:space="preserve">: каждый цикл опроса записывается с причиной — пустой буфер /  чужой текст / свой пакет (ждём ACK) / время до скана / файл уже обработан /  файл занят </w:t>
+      </w:r>
+      <w:r>
+        <w:rPr>
+          <w:rFonts w:ascii="Calibri" w:hAnsi="Calibri" w:cs="Calibri"/>
+          <w:color w:val="000000"/>
+        </w:rPr>
+        <w:lastRenderedPageBreak/>
+        <w:t>записью / не отправлен (причина выше в журнале).Сценарий 5: Сохранение RDP-сеанса (keep-alive)</w:t>
       </w:r>
       <w:r>
         <w:rPr>
@@ -1559,7 +1652,6 @@
           <w:rFonts w:ascii="Consolas" w:hAnsi="Consolas" w:cs="Calibri"/>
           <w:color w:val="7F7F7F"/>
         </w:rPr>
-        <w:lastRenderedPageBreak/>
         <w:t>powershell -File C:\CHANGE\FileTransfer.ps1 SetLocal Settings KeepAliveMinutes 1  (в общем setcp.ini</w:t>
       </w:r>
       <w:r>
@@ -2236,6 +2328,68 @@
           </w:p>
         </w:tc>
       </w:tr>
+      <w:tr>
+        <w:tc>
+          <w:tcPr>
+            <w:tcW w:w="5008" w:type="dxa"/>
+          </w:tcPr>
+          <w:p>
+            <w:pPr>
+              <w:rPr>
+                <w:rFonts w:ascii="Calibri" w:hAnsi="Calibri" w:cs="Calibri"/>
+                <w:color w:val="000000"/>
+              </w:rPr>
+            </w:pPr>
+            <w:r>
+              <w:rPr>
+                <w:rFonts w:ascii="Calibri" w:hAnsi="Calibri" w:cs="Calibri"/>
+                <w:color w:val="000000"/>
+              </w:rPr>
+              <w:t>ClearDisk</w:t>
+            </w:r>
+          </w:p>
+        </w:tc>
+        <w:tc>
+          <w:tcPr>
+            <w:tcW w:w="5009" w:type="dxa"/>
+          </w:tcPr>
+          <w:p>
+            <w:pPr>
+              <w:rPr>
+                <w:rFonts w:ascii="Calibri" w:hAnsi="Calibri" w:cs="Calibri"/>
+                <w:color w:val="000000"/>
+              </w:rPr>
+            </w:pPr>
+            <w:r>
+              <w:rPr>
+                <w:rFonts w:ascii="Calibri" w:hAnsi="Calibri" w:cs="Calibri"/>
+                <w:color w:val="000000"/>
+              </w:rPr>
+              <w:t>Диск</w:t>
+            </w:r>
+          </w:p>
+        </w:tc>
+        <w:tc>
+          <w:tcPr>
+            <w:tcW w:w="5009" w:type="dxa"/>
+          </w:tcPr>
+          <w:p>
+            <w:pPr>
+              <w:rPr>
+                <w:rFonts w:ascii="Calibri" w:hAnsi="Calibri" w:cs="Calibri"/>
+                <w:color w:val="000000"/>
+              </w:rPr>
+            </w:pPr>
+            <w:r>
+              <w:rPr>
+                <w:rFonts w:ascii="Calibri" w:hAnsi="Calibri" w:cs="Calibri"/>
+                <w:color w:val="000000"/>
+              </w:rPr>
+              <w:t>Очистить папку disk на обоих контурах одной командой: удаляет всё локально и отправляет команду очистки на другой контур</w:t>
+            </w:r>
+          </w:p>
+        </w:tc>
+      </w:tr>
     </w:tbl>
     <w:p>
       <w:pPr>
@@ -2358,7 +2512,7 @@
           <w:rFonts w:ascii="Calibri" w:hAnsi="Calibri" w:cs="Calibri"/>
           <w:color w:val="000000"/>
         </w:rPr>
-        <w:t xml:space="preserve">.Структура файла:        </w:t>
+        <w:t>.Структура файла:</w:t>
       </w:r>
       <w:r>
         <w:rPr>
@@ -2384,7 +2538,6 @@
           <w:color w:val="7F7F7F"/>
           <w:sz w:val="18"/>
         </w:rPr>
-        <w:lastRenderedPageBreak/>
         <w:t>ChunkThresholdMB=10        ; порог включения чанкового режима, МБ</w:t>
       </w:r>
     </w:p>
@@ -2737,6 +2890,7 @@
           <w:color w:val="7F7F7F"/>
           <w:sz w:val="18"/>
         </w:rPr>
+        <w:lastRenderedPageBreak/>
         <w:t>LogFile=C:\CHANGE\FileTransfer.log</w:t>
       </w:r>
     </w:p>
@@ -2801,7 +2955,6 @@
           <w:color w:val="7F7F7F"/>
           <w:sz w:val="18"/>
         </w:rPr>
-        <w:lastRenderedPageBreak/>
         <w:t>; Маска имени файла = каталог назначения</w:t>
       </w:r>
     </w:p>
@@ -3179,7 +3332,7 @@
           <w:rFonts w:ascii="Calibri" w:hAnsi="Calibri" w:cs="Calibri"/>
           <w:color w:val="000000"/>
         </w:rPr>
-        <w:t xml:space="preserve">);управлять им можно командами без ручного редактирования:        </w:t>
+        <w:t>);управлять им можно командами без ручного редактирования:</w:t>
       </w:r>
       <w:r>
         <w:rPr>
@@ -3418,7 +3571,7 @@
           <w:rFonts w:ascii="Calibri" w:hAnsi="Calibri" w:cs="Calibri"/>
           <w:color w:val="000000"/>
         </w:rPr>
-        <w:t xml:space="preserve"> с обновлённымкодом и настройками.        </w:t>
+        <w:t xml:space="preserve"> с обновлённымкодом и настройками.</w:t>
       </w:r>
       <w:r>
         <w:rPr>
@@ -3439,7 +3592,7 @@
         </w:rPr>
       </w:pPr>
       <w:r>
-        <w:t xml:space="preserve">На внутреннем контуре установку можно сразу дополнить локальными настройками,которые не уйдут на внешний контур (см. раздел «Локальные настройки контура»):        </w:t>
+        <w:t>На внутреннем контуре установку можно сразу дополнить локальными настройками,которые не уйдут на внешний контур (см. раздел «Локальные настройки контура»):</w:t>
       </w:r>
       <w:r>
         <w:rPr>
@@ -3465,6 +3618,7 @@
           <w:color w:val="7F7F7F"/>
           <w:sz w:val="18"/>
         </w:rPr>
+        <w:lastRenderedPageBreak/>
         <w:t>powershell -NoProfile -ExecutionPolicy Bypass -File Install.ps1 -LocalSettings "KeepAliveMinutes=1"</w:t>
       </w:r>
     </w:p>
@@ -3536,7 +3690,7 @@
           <w:rFonts w:ascii="Calibri" w:hAnsi="Calibri" w:cs="Calibri"/>
           <w:color w:val="000000"/>
         </w:rPr>
-        <w:t xml:space="preserve"> (можно запуститьи отдельно, без установки):        </w:t>
+        <w:t xml:space="preserve"> (можно запуститьи отдельно, без установки):</w:t>
       </w:r>
       <w:r>
         <w:rPr>
@@ -3577,7 +3731,6 @@
                 <w:b/>
                 <w:color w:val="000000"/>
               </w:rPr>
-              <w:lastRenderedPageBreak/>
               <w:t>Ярлык</w:t>
             </w:r>
           </w:p>
@@ -4184,6 +4337,7 @@
                 <w:rFonts w:ascii="Calibri" w:hAnsi="Calibri" w:cs="Calibri"/>
                 <w:color w:val="000000"/>
               </w:rPr>
+              <w:lastRenderedPageBreak/>
               <w:t>Ctrl + Alt + R</w:t>
             </w:r>
           </w:p>
@@ -5374,7 +5528,7 @@
     <w:link w:val="10"/>
     <w:uiPriority w:val="9"/>
     <w:qFormat/>
-    <w:rsid w:val="008C2ABF"/>
+    <w:rsid w:val="00BE5715"/>
     <w:pPr>
       <w:keepNext/>
       <w:keepLines/>
@@ -5396,7 +5550,7 @@
     <w:uiPriority w:val="9"/>
     <w:unhideWhenUsed/>
     <w:qFormat/>
-    <w:rsid w:val="008C2ABF"/>
+    <w:rsid w:val="00BE5715"/>
     <w:pPr>
       <w:keepNext/>
       <w:keepLines/>
@@ -5418,7 +5572,7 @@
     <w:uiPriority w:val="9"/>
     <w:unhideWhenUsed/>
     <w:qFormat/>
-    <w:rsid w:val="008C2ABF"/>
+    <w:rsid w:val="00BE5715"/>
     <w:pPr>
       <w:keepNext/>
       <w:keepLines/>
@@ -5464,7 +5618,7 @@
     <w:basedOn w:val="a0"/>
     <w:link w:val="1"/>
     <w:uiPriority w:val="9"/>
-    <w:rsid w:val="008C2ABF"/>
+    <w:rsid w:val="00BE5715"/>
     <w:rPr>
       <w:rFonts w:asciiTheme="majorHAnsi" w:eastAsiaTheme="majorEastAsia" w:hAnsiTheme="majorHAnsi" w:cstheme="majorBidi"/>
       <w:color w:val="2F5496" w:themeColor="accent1" w:themeShade="BF"/>
@@ -5477,7 +5631,7 @@
     <w:basedOn w:val="a0"/>
     <w:link w:val="2"/>
     <w:uiPriority w:val="9"/>
-    <w:rsid w:val="008C2ABF"/>
+    <w:rsid w:val="00BE5715"/>
     <w:rPr>
       <w:rFonts w:asciiTheme="majorHAnsi" w:eastAsiaTheme="majorEastAsia" w:hAnsiTheme="majorHAnsi" w:cstheme="majorBidi"/>
       <w:color w:val="2F5496" w:themeColor="accent1" w:themeShade="BF"/>
@@ -5489,7 +5643,7 @@
     <w:name w:val="Table Grid"/>
     <w:basedOn w:val="a1"/>
     <w:uiPriority w:val="39"/>
-    <w:rsid w:val="008C2ABF"/>
+    <w:rsid w:val="00BE5715"/>
     <w:pPr>
       <w:spacing w:after="0" w:line="240" w:lineRule="auto"/>
     </w:pPr>
@@ -5509,7 +5663,7 @@
     <w:basedOn w:val="a0"/>
     <w:link w:val="3"/>
     <w:uiPriority w:val="9"/>
-    <w:rsid w:val="008C2ABF"/>
+    <w:rsid w:val="00BE5715"/>
     <w:rPr>
       <w:rFonts w:asciiTheme="majorHAnsi" w:eastAsiaTheme="majorEastAsia" w:hAnsiTheme="majorHAnsi" w:cstheme="majorBidi"/>
       <w:color w:val="1F3763" w:themeColor="accent1" w:themeShade="7F"/>
@@ -5524,7 +5678,7 @@
     <w:autoRedefine/>
     <w:uiPriority w:val="39"/>
     <w:unhideWhenUsed/>
-    <w:rsid w:val="008C2ABF"/>
+    <w:rsid w:val="00BE5715"/>
     <w:pPr>
       <w:spacing w:after="100"/>
       <w:ind w:left="660"/>

</xml_diff>